<commit_message>
Add verified video tutorial links and muscle biomechanics breakdowns across all guides and web app
</commit_message>
<xml_diff>
--- a/Master_Transformation_Guide.docx
+++ b/Master_Transformation_Guide.docx
@@ -344,22 +344,42 @@
           </w:p>
           <w:p>
             <w:pPr>
+              <w:spacing w:before="0" w:after="40"/>
+            </w:pPr>
+            <w:r>
+              <w:rPr>
+                <w:b/>
+                <w:sz w:val="18"/>
+              </w:rPr>
+              <w:t xml:space="preserve">Prescription: </w:t>
+            </w:r>
+            <w:r>
+              <w:rPr>
+                <w:b/>
+                <w:color w:val="1E40AF"/>
+                <w:sz w:val="18"/>
+              </w:rPr>
+              <w:t>3 Sets × 8–10 Reps  |  90s Rest</w:t>
+            </w:r>
+          </w:p>
+          <w:p>
+            <w:pPr>
               <w:spacing w:before="0" w:after="80"/>
             </w:pPr>
             <w:r>
               <w:rPr>
                 <w:b/>
-                <w:sz w:val="18"/>
-              </w:rPr>
-              <w:t xml:space="preserve">Prescription: </w:t>
-            </w:r>
-            <w:r>
-              <w:rPr>
-                <w:b/>
-                <w:color w:val="1E40AF"/>
-                <w:sz w:val="18"/>
-              </w:rPr>
-              <w:t>3 Sets × 8–10 Reps  |  90s Rest</w:t>
+                <w:sz w:val="17"/>
+              </w:rPr>
+              <w:t xml:space="preserve">🎥 Video Tutorial: </w:t>
+            </w:r>
+            <w:r>
+              <w:rPr>
+                <w:color w:val="0E7490"/>
+                <w:sz w:val="17"/>
+                <w:u w:val="single"/>
+              </w:rPr>
+              <w:t>FIT.nl - https://www.youtube.com/watch?v=LiDArz1R2NU</w:t>
             </w:r>
           </w:p>
           <w:p>
@@ -582,22 +602,42 @@
           </w:p>
           <w:p>
             <w:pPr>
+              <w:spacing w:before="0" w:after="40"/>
+            </w:pPr>
+            <w:r>
+              <w:rPr>
+                <w:b/>
+                <w:sz w:val="18"/>
+              </w:rPr>
+              <w:t xml:space="preserve">Prescription: </w:t>
+            </w:r>
+            <w:r>
+              <w:rPr>
+                <w:b/>
+                <w:color w:val="1E40AF"/>
+                <w:sz w:val="18"/>
+              </w:rPr>
+              <w:t>3 Sets × 8–10 Reps  |  2 mins Rest</w:t>
+            </w:r>
+          </w:p>
+          <w:p>
+            <w:pPr>
               <w:spacing w:before="0" w:after="80"/>
             </w:pPr>
             <w:r>
               <w:rPr>
                 <w:b/>
-                <w:sz w:val="18"/>
-              </w:rPr>
-              <w:t xml:space="preserve">Prescription: </w:t>
-            </w:r>
-            <w:r>
-              <w:rPr>
-                <w:b/>
-                <w:color w:val="1E40AF"/>
-                <w:sz w:val="18"/>
-              </w:rPr>
-              <w:t>3 Sets × 8–10 Reps  |  2 mins Rest</w:t>
+                <w:sz w:val="17"/>
+              </w:rPr>
+              <w:t xml:space="preserve">🎥 Video Tutorial: </w:t>
+            </w:r>
+            <w:r>
+              <w:rPr>
+                <w:color w:val="0E7490"/>
+                <w:sz w:val="17"/>
+                <w:u w:val="single"/>
+              </w:rPr>
+              <w:t>Jeff Nippard - https://www.youtube.com/watch?v=vcBig73ojpE</w:t>
             </w:r>
           </w:p>
           <w:p>
@@ -820,22 +860,42 @@
           </w:p>
           <w:p>
             <w:pPr>
+              <w:spacing w:before="0" w:after="40"/>
+            </w:pPr>
+            <w:r>
+              <w:rPr>
+                <w:b/>
+                <w:sz w:val="18"/>
+              </w:rPr>
+              <w:t xml:space="preserve">Prescription: </w:t>
+            </w:r>
+            <w:r>
+              <w:rPr>
+                <w:b/>
+                <w:color w:val="1E40AF"/>
+                <w:sz w:val="18"/>
+              </w:rPr>
+              <w:t>4 Sets × 12–15 Reps  |  60s Rest</w:t>
+            </w:r>
+          </w:p>
+          <w:p>
+            <w:pPr>
               <w:spacing w:before="0" w:after="80"/>
             </w:pPr>
             <w:r>
               <w:rPr>
                 <w:b/>
-                <w:sz w:val="18"/>
-              </w:rPr>
-              <w:t xml:space="preserve">Prescription: </w:t>
-            </w:r>
-            <w:r>
-              <w:rPr>
-                <w:b/>
-                <w:color w:val="1E40AF"/>
-                <w:sz w:val="18"/>
-              </w:rPr>
-              <w:t>4 Sets × 12–15 Reps  |  60s Rest</w:t>
+                <w:sz w:val="17"/>
+              </w:rPr>
+              <w:t xml:space="preserve">🎥 Video Tutorial: </w:t>
+            </w:r>
+            <w:r>
+              <w:rPr>
+                <w:color w:val="0E7490"/>
+                <w:sz w:val="17"/>
+                <w:u w:val="single"/>
+              </w:rPr>
+              <w:t>Renaissance Periodization - https://www.youtube.com/watch?v=4hTUCDUQaNA</w:t>
             </w:r>
           </w:p>
           <w:p>
@@ -1058,22 +1118,42 @@
           </w:p>
           <w:p>
             <w:pPr>
+              <w:spacing w:before="0" w:after="40"/>
+            </w:pPr>
+            <w:r>
+              <w:rPr>
+                <w:b/>
+                <w:sz w:val="18"/>
+              </w:rPr>
+              <w:t xml:space="preserve">Prescription: </w:t>
+            </w:r>
+            <w:r>
+              <w:rPr>
+                <w:b/>
+                <w:color w:val="1E40AF"/>
+                <w:sz w:val="18"/>
+              </w:rPr>
+              <w:t>3 Sets × 8–10 Reps  |  90s Rest</w:t>
+            </w:r>
+          </w:p>
+          <w:p>
+            <w:pPr>
               <w:spacing w:before="0" w:after="80"/>
             </w:pPr>
             <w:r>
               <w:rPr>
                 <w:b/>
-                <w:sz w:val="18"/>
-              </w:rPr>
-              <w:t xml:space="preserve">Prescription: </w:t>
-            </w:r>
-            <w:r>
-              <w:rPr>
-                <w:b/>
-                <w:color w:val="1E40AF"/>
-                <w:sz w:val="18"/>
-              </w:rPr>
-              <w:t>3 Sets × 8–10 Reps  |  90s Rest</w:t>
+                <w:sz w:val="17"/>
+              </w:rPr>
+              <w:t xml:space="preserve">🎥 Video Tutorial: </w:t>
+            </w:r>
+            <w:r>
+              <w:rPr>
+                <w:color w:val="0E7490"/>
+                <w:sz w:val="17"/>
+                <w:u w:val="single"/>
+              </w:rPr>
+              <w:t>Colossus Fitness - https://www.youtube.com/watch?v=NAtsHyowOXg</w:t>
             </w:r>
           </w:p>
           <w:p>
@@ -1296,22 +1376,42 @@
           </w:p>
           <w:p>
             <w:pPr>
+              <w:spacing w:before="0" w:after="40"/>
+            </w:pPr>
+            <w:r>
+              <w:rPr>
+                <w:b/>
+                <w:sz w:val="18"/>
+              </w:rPr>
+              <w:t xml:space="preserve">Prescription: </w:t>
+            </w:r>
+            <w:r>
+              <w:rPr>
+                <w:b/>
+                <w:color w:val="1E40AF"/>
+                <w:sz w:val="18"/>
+              </w:rPr>
+              <w:t>3 Sets × 10–12 Reps  |  75s Rest</w:t>
+            </w:r>
+          </w:p>
+          <w:p>
+            <w:pPr>
               <w:spacing w:before="0" w:after="80"/>
             </w:pPr>
             <w:r>
               <w:rPr>
                 <w:b/>
-                <w:sz w:val="18"/>
-              </w:rPr>
-              <w:t xml:space="preserve">Prescription: </w:t>
-            </w:r>
-            <w:r>
-              <w:rPr>
-                <w:b/>
-                <w:color w:val="1E40AF"/>
-                <w:sz w:val="18"/>
-              </w:rPr>
-              <w:t>3 Sets × 10–12 Reps  |  75s Rest</w:t>
+                <w:sz w:val="17"/>
+              </w:rPr>
+              <w:t xml:space="preserve">🎥 Video Tutorial: </w:t>
+            </w:r>
+            <w:r>
+              <w:rPr>
+                <w:color w:val="0E7490"/>
+                <w:sz w:val="17"/>
+                <w:u w:val="single"/>
+              </w:rPr>
+              <w:t>Scott Herman Fitness - https://www.youtube.com/watch?v=fYqswDVbJDg</w:t>
             </w:r>
           </w:p>
           <w:p>
@@ -1534,22 +1634,42 @@
           </w:p>
           <w:p>
             <w:pPr>
+              <w:spacing w:before="0" w:after="40"/>
+            </w:pPr>
+            <w:r>
+              <w:rPr>
+                <w:b/>
+                <w:sz w:val="18"/>
+              </w:rPr>
+              <w:t xml:space="preserve">Prescription: </w:t>
+            </w:r>
+            <w:r>
+              <w:rPr>
+                <w:b/>
+                <w:color w:val="1E40AF"/>
+                <w:sz w:val="18"/>
+              </w:rPr>
+              <w:t>3 Sets × 12–15 Reps  |  60s Rest</w:t>
+            </w:r>
+          </w:p>
+          <w:p>
+            <w:pPr>
               <w:spacing w:before="0" w:after="80"/>
             </w:pPr>
             <w:r>
               <w:rPr>
                 <w:b/>
-                <w:sz w:val="18"/>
-              </w:rPr>
-              <w:t xml:space="preserve">Prescription: </w:t>
-            </w:r>
-            <w:r>
-              <w:rPr>
-                <w:b/>
-                <w:color w:val="1E40AF"/>
-                <w:sz w:val="18"/>
-              </w:rPr>
-              <w:t>3 Sets × 12–15 Reps  |  60s Rest</w:t>
+                <w:sz w:val="17"/>
+              </w:rPr>
+              <w:t xml:space="preserve">🎥 Video Tutorial: </w:t>
+            </w:r>
+            <w:r>
+              <w:rPr>
+                <w:color w:val="0E7490"/>
+                <w:sz w:val="17"/>
+                <w:u w:val="single"/>
+              </w:rPr>
+              <w:t>Scott Herman Fitness - https://www.youtube.com/watch?v=_w-HpW70nSQ</w:t>
             </w:r>
           </w:p>
           <w:p>
@@ -1798,22 +1918,42 @@
           </w:p>
           <w:p>
             <w:pPr>
+              <w:spacing w:before="0" w:after="40"/>
+            </w:pPr>
+            <w:r>
+              <w:rPr>
+                <w:b/>
+                <w:sz w:val="18"/>
+              </w:rPr>
+              <w:t xml:space="preserve">Prescription: </w:t>
+            </w:r>
+            <w:r>
+              <w:rPr>
+                <w:b/>
+                <w:color w:val="1E40AF"/>
+                <w:sz w:val="18"/>
+              </w:rPr>
+              <w:t>3 Sets × 6–8 Reps  |  2 mins Rest</w:t>
+            </w:r>
+          </w:p>
+          <w:p>
+            <w:pPr>
               <w:spacing w:before="0" w:after="80"/>
             </w:pPr>
             <w:r>
               <w:rPr>
                 <w:b/>
-                <w:sz w:val="18"/>
-              </w:rPr>
-              <w:t xml:space="preserve">Prescription: </w:t>
-            </w:r>
-            <w:r>
-              <w:rPr>
-                <w:b/>
-                <w:color w:val="1E40AF"/>
-                <w:sz w:val="18"/>
-              </w:rPr>
-              <w:t>3 Sets × 6–8 Reps  |  2 mins Rest</w:t>
+                <w:sz w:val="17"/>
+              </w:rPr>
+              <w:t xml:space="preserve">🎥 Video Tutorial: </w:t>
+            </w:r>
+            <w:r>
+              <w:rPr>
+                <w:color w:val="0E7490"/>
+                <w:sz w:val="17"/>
+                <w:u w:val="single"/>
+              </w:rPr>
+              <w:t>Scott Herman Fitness - https://www.youtube.com/watch?v=AHnX-aimA4E</w:t>
             </w:r>
           </w:p>
           <w:p>
@@ -2036,22 +2176,42 @@
           </w:p>
           <w:p>
             <w:pPr>
+              <w:spacing w:before="0" w:after="40"/>
+            </w:pPr>
+            <w:r>
+              <w:rPr>
+                <w:b/>
+                <w:sz w:val="18"/>
+              </w:rPr>
+              <w:t xml:space="preserve">Prescription: </w:t>
+            </w:r>
+            <w:r>
+              <w:rPr>
+                <w:b/>
+                <w:color w:val="1E40AF"/>
+                <w:sz w:val="18"/>
+              </w:rPr>
+              <w:t>3 Sets × 8–10 Reps / leg  |  90s Rest between legs</w:t>
+            </w:r>
+          </w:p>
+          <w:p>
+            <w:pPr>
               <w:spacing w:before="0" w:after="80"/>
             </w:pPr>
             <w:r>
               <w:rPr>
                 <w:b/>
-                <w:sz w:val="18"/>
-              </w:rPr>
-              <w:t xml:space="preserve">Prescription: </w:t>
-            </w:r>
-            <w:r>
-              <w:rPr>
-                <w:b/>
-                <w:color w:val="1E40AF"/>
-                <w:sz w:val="18"/>
-              </w:rPr>
-              <w:t>3 Sets × 8–10 Reps / leg  |  90s Rest between legs</w:t>
+                <w:sz w:val="17"/>
+              </w:rPr>
+              <w:t xml:space="preserve">🎥 Video Tutorial: </w:t>
+            </w:r>
+            <w:r>
+              <w:rPr>
+                <w:color w:val="0E7490"/>
+                <w:sz w:val="17"/>
+                <w:u w:val="single"/>
+              </w:rPr>
+              <w:t>Squat University - https://www.youtube.com/watch?v=hPlKPjohFS0</w:t>
             </w:r>
           </w:p>
           <w:p>
@@ -2274,22 +2434,42 @@
           </w:p>
           <w:p>
             <w:pPr>
+              <w:spacing w:before="0" w:after="40"/>
+            </w:pPr>
+            <w:r>
+              <w:rPr>
+                <w:b/>
+                <w:sz w:val="18"/>
+              </w:rPr>
+              <w:t xml:space="preserve">Prescription: </w:t>
+            </w:r>
+            <w:r>
+              <w:rPr>
+                <w:b/>
+                <w:color w:val="1E40AF"/>
+                <w:sz w:val="18"/>
+              </w:rPr>
+              <w:t>3 Sets × 10–12 Reps  |  90s Rest</w:t>
+            </w:r>
+          </w:p>
+          <w:p>
+            <w:pPr>
               <w:spacing w:before="0" w:after="80"/>
             </w:pPr>
             <w:r>
               <w:rPr>
                 <w:b/>
-                <w:sz w:val="18"/>
-              </w:rPr>
-              <w:t xml:space="preserve">Prescription: </w:t>
-            </w:r>
-            <w:r>
-              <w:rPr>
-                <w:b/>
-                <w:color w:val="1E40AF"/>
-                <w:sz w:val="18"/>
-              </w:rPr>
-              <w:t>3 Sets × 10–12 Reps  |  90s Rest</w:t>
+                <w:sz w:val="17"/>
+              </w:rPr>
+              <w:t xml:space="preserve">🎥 Video Tutorial: </w:t>
+            </w:r>
+            <w:r>
+              <w:rPr>
+                <w:color w:val="0E7490"/>
+                <w:sz w:val="17"/>
+                <w:u w:val="single"/>
+              </w:rPr>
+              <w:t>Scott Herman Fitness - https://www.youtube.com/watch?v=oujca3_Shgw</w:t>
             </w:r>
           </w:p>
           <w:p>
@@ -2512,22 +2692,42 @@
           </w:p>
           <w:p>
             <w:pPr>
+              <w:spacing w:before="0" w:after="40"/>
+            </w:pPr>
+            <w:r>
+              <w:rPr>
+                <w:b/>
+                <w:sz w:val="18"/>
+              </w:rPr>
+              <w:t xml:space="preserve">Prescription: </w:t>
+            </w:r>
+            <w:r>
+              <w:rPr>
+                <w:b/>
+                <w:color w:val="1E40AF"/>
+                <w:sz w:val="18"/>
+              </w:rPr>
+              <w:t>4 Sets × 12–15 Reps  |  60s Rest</w:t>
+            </w:r>
+          </w:p>
+          <w:p>
+            <w:pPr>
               <w:spacing w:before="0" w:after="80"/>
             </w:pPr>
             <w:r>
               <w:rPr>
                 <w:b/>
-                <w:sz w:val="18"/>
-              </w:rPr>
-              <w:t xml:space="preserve">Prescription: </w:t>
-            </w:r>
-            <w:r>
-              <w:rPr>
-                <w:b/>
-                <w:color w:val="1E40AF"/>
-                <w:sz w:val="18"/>
-              </w:rPr>
-              <w:t>4 Sets × 12–15 Reps  |  60s Rest</w:t>
+                <w:sz w:val="17"/>
+              </w:rPr>
+              <w:t xml:space="preserve">🎥 Video Tutorial: </w:t>
+            </w:r>
+            <w:r>
+              <w:rPr>
+                <w:color w:val="0E7490"/>
+                <w:sz w:val="17"/>
+                <w:u w:val="single"/>
+              </w:rPr>
+              <w:t>Jeff Nippard - https://www.youtube.com/watch?v=-qsRtp_PbVM</w:t>
             </w:r>
           </w:p>
           <w:p>
@@ -2750,22 +2950,42 @@
           </w:p>
           <w:p>
             <w:pPr>
+              <w:spacing w:before="0" w:after="40"/>
+            </w:pPr>
+            <w:r>
+              <w:rPr>
+                <w:b/>
+                <w:sz w:val="18"/>
+              </w:rPr>
+              <w:t xml:space="preserve">Prescription: </w:t>
+            </w:r>
+            <w:r>
+              <w:rPr>
+                <w:b/>
+                <w:color w:val="1E40AF"/>
+                <w:sz w:val="18"/>
+              </w:rPr>
+              <w:t>3 Sets × 12–15 Reps  |  60s Rest</w:t>
+            </w:r>
+          </w:p>
+          <w:p>
+            <w:pPr>
               <w:spacing w:before="0" w:after="80"/>
             </w:pPr>
             <w:r>
               <w:rPr>
                 <w:b/>
-                <w:sz w:val="18"/>
-              </w:rPr>
-              <w:t xml:space="preserve">Prescription: </w:t>
-            </w:r>
-            <w:r>
-              <w:rPr>
-                <w:b/>
-                <w:color w:val="1E40AF"/>
-                <w:sz w:val="18"/>
-              </w:rPr>
-              <w:t>3 Sets × 12–15 Reps  |  60s Rest</w:t>
+                <w:sz w:val="17"/>
+              </w:rPr>
+              <w:t xml:space="preserve">🎥 Video Tutorial: </w:t>
+            </w:r>
+            <w:r>
+              <w:rPr>
+                <w:color w:val="0E7490"/>
+                <w:sz w:val="17"/>
+                <w:u w:val="single"/>
+              </w:rPr>
+              <w:t>Andrew Coates - https://www.youtube.com/watch?v=2TC-VJ40XwA</w:t>
             </w:r>
           </w:p>
           <w:p>
@@ -3014,22 +3234,42 @@
           </w:p>
           <w:p>
             <w:pPr>
+              <w:spacing w:before="0" w:after="40"/>
+            </w:pPr>
+            <w:r>
+              <w:rPr>
+                <w:b/>
+                <w:sz w:val="18"/>
+              </w:rPr>
+              <w:t xml:space="preserve">Prescription: </w:t>
+            </w:r>
+            <w:r>
+              <w:rPr>
+                <w:b/>
+                <w:color w:val="1E40AF"/>
+                <w:sz w:val="18"/>
+              </w:rPr>
+              <w:t>3 Sets × 8–10 Reps  |  90s Rest</w:t>
+            </w:r>
+          </w:p>
+          <w:p>
+            <w:pPr>
               <w:spacing w:before="0" w:after="80"/>
             </w:pPr>
             <w:r>
               <w:rPr>
                 <w:b/>
-                <w:sz w:val="18"/>
-              </w:rPr>
-              <w:t xml:space="preserve">Prescription: </w:t>
-            </w:r>
-            <w:r>
-              <w:rPr>
-                <w:b/>
-                <w:color w:val="1E40AF"/>
-                <w:sz w:val="18"/>
-              </w:rPr>
-              <w:t>3 Sets × 8–10 Reps  |  90s Rest</w:t>
+                <w:sz w:val="17"/>
+              </w:rPr>
+              <w:t xml:space="preserve">🎥 Video Tutorial: </w:t>
+            </w:r>
+            <w:r>
+              <w:rPr>
+                <w:color w:val="0E7490"/>
+                <w:sz w:val="17"/>
+                <w:u w:val="single"/>
+              </w:rPr>
+              <w:t>DrillFit Training - https://www.youtube.com/watch?v=yltjwI98GmI</w:t>
             </w:r>
           </w:p>
           <w:p>
@@ -3252,22 +3492,42 @@
           </w:p>
           <w:p>
             <w:pPr>
+              <w:spacing w:before="0" w:after="40"/>
+            </w:pPr>
+            <w:r>
+              <w:rPr>
+                <w:b/>
+                <w:sz w:val="18"/>
+              </w:rPr>
+              <w:t xml:space="preserve">Prescription: </w:t>
+            </w:r>
+            <w:r>
+              <w:rPr>
+                <w:b/>
+                <w:color w:val="1E40AF"/>
+                <w:sz w:val="18"/>
+              </w:rPr>
+              <w:t>3 Sets × 8–10 Reps  |  90s Rest</w:t>
+            </w:r>
+          </w:p>
+          <w:p>
+            <w:pPr>
               <w:spacing w:before="0" w:after="80"/>
             </w:pPr>
             <w:r>
               <w:rPr>
                 <w:b/>
-                <w:sz w:val="18"/>
-              </w:rPr>
-              <w:t xml:space="preserve">Prescription: </w:t>
-            </w:r>
-            <w:r>
-              <w:rPr>
-                <w:b/>
-                <w:color w:val="1E40AF"/>
-                <w:sz w:val="18"/>
-              </w:rPr>
-              <w:t>3 Sets × 8–10 Reps  |  90s Rest</w:t>
+                <w:sz w:val="17"/>
+              </w:rPr>
+              <w:t xml:space="preserve">🎥 Video Tutorial: </w:t>
+            </w:r>
+            <w:r>
+              <w:rPr>
+                <w:color w:val="0E7490"/>
+                <w:sz w:val="17"/>
+                <w:u w:val="single"/>
+              </w:rPr>
+              <w:t>Scott Herman Fitness - https://www.youtube.com/watch?v=7o2oolbmzeI</w:t>
             </w:r>
           </w:p>
           <w:p>
@@ -3490,22 +3750,42 @@
           </w:p>
           <w:p>
             <w:pPr>
+              <w:spacing w:before="0" w:after="40"/>
+            </w:pPr>
+            <w:r>
+              <w:rPr>
+                <w:b/>
+                <w:sz w:val="18"/>
+              </w:rPr>
+              <w:t xml:space="preserve">Prescription: </w:t>
+            </w:r>
+            <w:r>
+              <w:rPr>
+                <w:b/>
+                <w:color w:val="1E40AF"/>
+                <w:sz w:val="18"/>
+              </w:rPr>
+              <w:t>4 Sets × 12–15 Reps  |  60s Rest</w:t>
+            </w:r>
+          </w:p>
+          <w:p>
+            <w:pPr>
               <w:spacing w:before="0" w:after="80"/>
             </w:pPr>
             <w:r>
               <w:rPr>
                 <w:b/>
-                <w:sz w:val="18"/>
-              </w:rPr>
-              <w:t xml:space="preserve">Prescription: </w:t>
-            </w:r>
-            <w:r>
-              <w:rPr>
-                <w:b/>
-                <w:color w:val="1E40AF"/>
-                <w:sz w:val="18"/>
-              </w:rPr>
-              <w:t>4 Sets × 12–15 Reps  |  60s Rest</w:t>
+                <w:sz w:val="17"/>
+              </w:rPr>
+              <w:t xml:space="preserve">🎥 Video Tutorial: </w:t>
+            </w:r>
+            <w:r>
+              <w:rPr>
+                <w:color w:val="0E7490"/>
+                <w:sz w:val="17"/>
+                <w:u w:val="single"/>
+              </w:rPr>
+              <w:t>Mind Pump TV - https://www.youtube.com/watch?v=6yMdhi2DVao</w:t>
             </w:r>
           </w:p>
           <w:p>
@@ -3728,22 +4008,42 @@
           </w:p>
           <w:p>
             <w:pPr>
+              <w:spacing w:before="0" w:after="40"/>
+            </w:pPr>
+            <w:r>
+              <w:rPr>
+                <w:b/>
+                <w:sz w:val="18"/>
+              </w:rPr>
+              <w:t xml:space="preserve">Prescription: </w:t>
+            </w:r>
+            <w:r>
+              <w:rPr>
+                <w:b/>
+                <w:color w:val="1E40AF"/>
+                <w:sz w:val="18"/>
+              </w:rPr>
+              <w:t>3 Sets × 12–15 Reps  |  75s Rest</w:t>
+            </w:r>
+          </w:p>
+          <w:p>
+            <w:pPr>
               <w:spacing w:before="0" w:after="80"/>
             </w:pPr>
             <w:r>
               <w:rPr>
                 <w:b/>
-                <w:sz w:val="18"/>
-              </w:rPr>
-              <w:t xml:space="preserve">Prescription: </w:t>
-            </w:r>
-            <w:r>
-              <w:rPr>
-                <w:b/>
-                <w:color w:val="1E40AF"/>
-                <w:sz w:val="18"/>
-              </w:rPr>
-              <w:t>3 Sets × 12–15 Reps  |  75s Rest</w:t>
+                <w:sz w:val="17"/>
+              </w:rPr>
+              <w:t xml:space="preserve">🎥 Video Tutorial: </w:t>
+            </w:r>
+            <w:r>
+              <w:rPr>
+                <w:color w:val="0E7490"/>
+                <w:sz w:val="17"/>
+                <w:u w:val="single"/>
+              </w:rPr>
+              <w:t>mountaindog1 (John Meadows) - https://www.youtube.com/watch?v=UOjSq3uidqY</w:t>
             </w:r>
           </w:p>
           <w:p>
@@ -3966,22 +4266,42 @@
           </w:p>
           <w:p>
             <w:pPr>
+              <w:spacing w:before="0" w:after="40"/>
+            </w:pPr>
+            <w:r>
+              <w:rPr>
+                <w:b/>
+                <w:sz w:val="18"/>
+              </w:rPr>
+              <w:t xml:space="preserve">Prescription: </w:t>
+            </w:r>
+            <w:r>
+              <w:rPr>
+                <w:b/>
+                <w:color w:val="1E40AF"/>
+                <w:sz w:val="18"/>
+              </w:rPr>
+              <w:t>3 Sets × 10–12 Reps  |  60s Rest</w:t>
+            </w:r>
+          </w:p>
+          <w:p>
+            <w:pPr>
               <w:spacing w:before="0" w:after="80"/>
             </w:pPr>
             <w:r>
               <w:rPr>
                 <w:b/>
-                <w:sz w:val="18"/>
-              </w:rPr>
-              <w:t xml:space="preserve">Prescription: </w:t>
-            </w:r>
-            <w:r>
-              <w:rPr>
-                <w:b/>
-                <w:color w:val="1E40AF"/>
-                <w:sz w:val="18"/>
-              </w:rPr>
-              <w:t>3 Sets × 10–12 Reps  |  60s Rest</w:t>
+                <w:sz w:val="17"/>
+              </w:rPr>
+              <w:t xml:space="preserve">🎥 Video Tutorial: </w:t>
+            </w:r>
+            <w:r>
+              <w:rPr>
+                <w:color w:val="0E7490"/>
+                <w:sz w:val="17"/>
+                <w:u w:val="single"/>
+              </w:rPr>
+              <w:t>Scott Herman Fitness - https://www.youtube.com/watch?v=8XLxfXROrTo</w:t>
             </w:r>
           </w:p>
           <w:p>
@@ -4204,22 +4524,42 @@
           </w:p>
           <w:p>
             <w:pPr>
+              <w:spacing w:before="0" w:after="40"/>
+            </w:pPr>
+            <w:r>
+              <w:rPr>
+                <w:b/>
+                <w:sz w:val="18"/>
+              </w:rPr>
+              <w:t xml:space="preserve">Prescription: </w:t>
+            </w:r>
+            <w:r>
+              <w:rPr>
+                <w:b/>
+                <w:color w:val="1E40AF"/>
+                <w:sz w:val="18"/>
+              </w:rPr>
+              <w:t>3 Sets × 10–12 Reps  |  60s Rest</w:t>
+            </w:r>
+          </w:p>
+          <w:p>
+            <w:pPr>
               <w:spacing w:before="0" w:after="80"/>
             </w:pPr>
             <w:r>
               <w:rPr>
                 <w:b/>
-                <w:sz w:val="18"/>
-              </w:rPr>
-              <w:t xml:space="preserve">Prescription: </w:t>
-            </w:r>
-            <w:r>
-              <w:rPr>
-                <w:b/>
-                <w:color w:val="1E40AF"/>
-                <w:sz w:val="18"/>
-              </w:rPr>
-              <w:t>3 Sets × 10–12 Reps  |  60s Rest</w:t>
+                <w:sz w:val="17"/>
+              </w:rPr>
+              <w:t xml:space="preserve">🎥 Video Tutorial: </w:t>
+            </w:r>
+            <w:r>
+              <w:rPr>
+                <w:color w:val="0E7490"/>
+                <w:sz w:val="17"/>
+                <w:u w:val="single"/>
+              </w:rPr>
+              <w:t>Scott Herman Fitness - https://www.youtube.com/watch?v=nbcgEmZ0Be4</w:t>
             </w:r>
           </w:p>
           <w:p>
@@ -4468,22 +4808,42 @@
           </w:p>
           <w:p>
             <w:pPr>
+              <w:spacing w:before="0" w:after="40"/>
+            </w:pPr>
+            <w:r>
+              <w:rPr>
+                <w:b/>
+                <w:sz w:val="18"/>
+              </w:rPr>
+              <w:t xml:space="preserve">Prescription: </w:t>
+            </w:r>
+            <w:r>
+              <w:rPr>
+                <w:b/>
+                <w:color w:val="1E40AF"/>
+                <w:sz w:val="18"/>
+              </w:rPr>
+              <w:t>3 Sets × 8–10 Reps  |  2 mins Rest</w:t>
+            </w:r>
+          </w:p>
+          <w:p>
+            <w:pPr>
               <w:spacing w:before="0" w:after="80"/>
             </w:pPr>
             <w:r>
               <w:rPr>
                 <w:b/>
-                <w:sz w:val="18"/>
-              </w:rPr>
-              <w:t xml:space="preserve">Prescription: </w:t>
-            </w:r>
-            <w:r>
-              <w:rPr>
-                <w:b/>
-                <w:color w:val="1E40AF"/>
-                <w:sz w:val="18"/>
-              </w:rPr>
-              <w:t>3 Sets × 8–10 Reps  |  2 mins Rest</w:t>
+                <w:sz w:val="17"/>
+              </w:rPr>
+              <w:t xml:space="preserve">🎥 Video Tutorial: </w:t>
+            </w:r>
+            <w:r>
+              <w:rPr>
+                <w:color w:val="0E7490"/>
+                <w:sz w:val="17"/>
+                <w:u w:val="single"/>
+              </w:rPr>
+              <w:t>Max Euceda - https://www.youtube.com/watch?v=3VXmecChYYM</w:t>
             </w:r>
           </w:p>
           <w:p>
@@ -4706,22 +5066,42 @@
           </w:p>
           <w:p>
             <w:pPr>
+              <w:spacing w:before="0" w:after="40"/>
+            </w:pPr>
+            <w:r>
+              <w:rPr>
+                <w:b/>
+                <w:sz w:val="18"/>
+              </w:rPr>
+              <w:t xml:space="preserve">Prescription: </w:t>
+            </w:r>
+            <w:r>
+              <w:rPr>
+                <w:b/>
+                <w:color w:val="1E40AF"/>
+                <w:sz w:val="18"/>
+              </w:rPr>
+              <w:t>3 Sets × 10–12 Reps  |  90s Rest</w:t>
+            </w:r>
+          </w:p>
+          <w:p>
+            <w:pPr>
               <w:spacing w:before="0" w:after="80"/>
             </w:pPr>
             <w:r>
               <w:rPr>
                 <w:b/>
-                <w:sz w:val="18"/>
-              </w:rPr>
-              <w:t xml:space="preserve">Prescription: </w:t>
-            </w:r>
-            <w:r>
-              <w:rPr>
-                <w:b/>
-                <w:color w:val="1E40AF"/>
-                <w:sz w:val="18"/>
-              </w:rPr>
-              <w:t>3 Sets × 10–12 Reps  |  90s Rest</w:t>
+                <w:sz w:val="17"/>
+              </w:rPr>
+              <w:t xml:space="preserve">🎥 Video Tutorial: </w:t>
+            </w:r>
+            <w:r>
+              <w:rPr>
+                <w:color w:val="0E7490"/>
+                <w:sz w:val="17"/>
+                <w:u w:val="single"/>
+              </w:rPr>
+              <w:t>Physique Development - https://www.youtube.com/watch?v=M_xoJ0iRLFc</w:t>
             </w:r>
           </w:p>
           <w:p>
@@ -4944,22 +5324,42 @@
           </w:p>
           <w:p>
             <w:pPr>
+              <w:spacing w:before="0" w:after="40"/>
+            </w:pPr>
+            <w:r>
+              <w:rPr>
+                <w:b/>
+                <w:sz w:val="18"/>
+              </w:rPr>
+              <w:t xml:space="preserve">Prescription: </w:t>
+            </w:r>
+            <w:r>
+              <w:rPr>
+                <w:b/>
+                <w:color w:val="1E40AF"/>
+                <w:sz w:val="18"/>
+              </w:rPr>
+              <w:t>3 Sets × 10–12 Reps  |  75s Rest</w:t>
+            </w:r>
+          </w:p>
+          <w:p>
+            <w:pPr>
               <w:spacing w:before="0" w:after="80"/>
             </w:pPr>
             <w:r>
               <w:rPr>
                 <w:b/>
-                <w:sz w:val="18"/>
-              </w:rPr>
-              <w:t xml:space="preserve">Prescription: </w:t>
-            </w:r>
-            <w:r>
-              <w:rPr>
-                <w:b/>
-                <w:color w:val="1E40AF"/>
-                <w:sz w:val="18"/>
-              </w:rPr>
-              <w:t>3 Sets × 10–12 Reps  |  75s Rest</w:t>
+                <w:sz w:val="17"/>
+              </w:rPr>
+              <w:t xml:space="preserve">🎥 Video Tutorial: </w:t>
+            </w:r>
+            <w:r>
+              <w:rPr>
+                <w:color w:val="0E7490"/>
+                <w:sz w:val="17"/>
+                <w:u w:val="single"/>
+              </w:rPr>
+              <w:t>Scott Herman Fitness - https://www.youtube.com/watch?v=1Tq3QdYUuHs</w:t>
             </w:r>
           </w:p>
           <w:p>
@@ -5182,22 +5582,42 @@
           </w:p>
           <w:p>
             <w:pPr>
+              <w:spacing w:before="0" w:after="40"/>
+            </w:pPr>
+            <w:r>
+              <w:rPr>
+                <w:b/>
+                <w:sz w:val="18"/>
+              </w:rPr>
+              <w:t xml:space="preserve">Prescription: </w:t>
+            </w:r>
+            <w:r>
+              <w:rPr>
+                <w:b/>
+                <w:color w:val="1E40AF"/>
+                <w:sz w:val="18"/>
+              </w:rPr>
+              <w:t>3 Sets × 12–15 Reps  |  60s Rest</w:t>
+            </w:r>
+          </w:p>
+          <w:p>
+            <w:pPr>
               <w:spacing w:before="0" w:after="80"/>
             </w:pPr>
             <w:r>
               <w:rPr>
                 <w:b/>
-                <w:sz w:val="18"/>
-              </w:rPr>
-              <w:t xml:space="preserve">Prescription: </w:t>
-            </w:r>
-            <w:r>
-              <w:rPr>
-                <w:b/>
-                <w:color w:val="1E40AF"/>
-                <w:sz w:val="18"/>
-              </w:rPr>
-              <w:t>3 Sets × 12–15 Reps  |  60s Rest</w:t>
+                <w:sz w:val="17"/>
+              </w:rPr>
+              <w:t xml:space="preserve">🎥 Video Tutorial: </w:t>
+            </w:r>
+            <w:r>
+              <w:rPr>
+                <w:color w:val="0E7490"/>
+                <w:sz w:val="17"/>
+                <w:u w:val="single"/>
+              </w:rPr>
+              <w:t>Live Lean TV - https://www.youtube.com/watch?v=fFWpWJy8ybU</w:t>
             </w:r>
           </w:p>
           <w:p>
@@ -5420,22 +5840,42 @@
           </w:p>
           <w:p>
             <w:pPr>
+              <w:spacing w:before="0" w:after="40"/>
+            </w:pPr>
+            <w:r>
+              <w:rPr>
+                <w:b/>
+                <w:sz w:val="18"/>
+              </w:rPr>
+              <w:t xml:space="preserve">Prescription: </w:t>
+            </w:r>
+            <w:r>
+              <w:rPr>
+                <w:b/>
+                <w:color w:val="1E40AF"/>
+                <w:sz w:val="18"/>
+              </w:rPr>
+              <w:t>3 Sets × 45–60s Hold  |  60s Rest</w:t>
+            </w:r>
+          </w:p>
+          <w:p>
+            <w:pPr>
               <w:spacing w:before="0" w:after="80"/>
             </w:pPr>
             <w:r>
               <w:rPr>
                 <w:b/>
-                <w:sz w:val="18"/>
-              </w:rPr>
-              <w:t xml:space="preserve">Prescription: </w:t>
-            </w:r>
-            <w:r>
-              <w:rPr>
-                <w:b/>
-                <w:color w:val="1E40AF"/>
-                <w:sz w:val="18"/>
-              </w:rPr>
-              <w:t>3 Sets × 45–60s Hold  |  60s Rest</w:t>
+                <w:sz w:val="17"/>
+              </w:rPr>
+              <w:t xml:space="preserve">🎥 Video Tutorial: </w:t>
+            </w:r>
+            <w:r>
+              <w:rPr>
+                <w:color w:val="0E7490"/>
+                <w:sz w:val="17"/>
+                <w:u w:val="single"/>
+              </w:rPr>
+              <w:t>FIT.nl - https://www.youtube.com/watch?v=LARw21BBiDk</w:t>
             </w:r>
           </w:p>
           <w:p>
@@ -5684,22 +6124,42 @@
           </w:p>
           <w:p>
             <w:pPr>
+              <w:spacing w:before="0" w:after="40"/>
+            </w:pPr>
+            <w:r>
+              <w:rPr>
+                <w:b/>
+                <w:sz w:val="18"/>
+              </w:rPr>
+              <w:t xml:space="preserve">Prescription: </w:t>
+            </w:r>
+            <w:r>
+              <w:rPr>
+                <w:b/>
+                <w:color w:val="1E40AF"/>
+                <w:sz w:val="18"/>
+              </w:rPr>
+              <w:t>3 Sets × 8–10 Reps  |  90s Rest</w:t>
+            </w:r>
+          </w:p>
+          <w:p>
+            <w:pPr>
               <w:spacing w:before="0" w:after="80"/>
             </w:pPr>
             <w:r>
               <w:rPr>
                 <w:b/>
-                <w:sz w:val="18"/>
-              </w:rPr>
-              <w:t xml:space="preserve">Prescription: </w:t>
-            </w:r>
-            <w:r>
-              <w:rPr>
-                <w:b/>
-                <w:color w:val="1E40AF"/>
-                <w:sz w:val="18"/>
-              </w:rPr>
-              <w:t>3 Sets × 8–10 Reps  |  90s Rest</w:t>
+                <w:sz w:val="17"/>
+              </w:rPr>
+              <w:t xml:space="preserve">🎥 Video Tutorial: </w:t>
+            </w:r>
+            <w:r>
+              <w:rPr>
+                <w:color w:val="0E7490"/>
+                <w:sz w:val="17"/>
+                <w:u w:val="single"/>
+              </w:rPr>
+              <w:t>FIT.nl - https://www.youtube.com/watch?v=LiDArz1R2NU</w:t>
             </w:r>
           </w:p>
           <w:p>
@@ -5922,22 +6382,42 @@
           </w:p>
           <w:p>
             <w:pPr>
+              <w:spacing w:before="0" w:after="40"/>
+            </w:pPr>
+            <w:r>
+              <w:rPr>
+                <w:b/>
+                <w:sz w:val="18"/>
+              </w:rPr>
+              <w:t xml:space="preserve">Prescription: </w:t>
+            </w:r>
+            <w:r>
+              <w:rPr>
+                <w:b/>
+                <w:color w:val="1E40AF"/>
+                <w:sz w:val="18"/>
+              </w:rPr>
+              <w:t>4 Sets × 12–15 Reps (Drop-Set on 4th)  |  60s Rest</w:t>
+            </w:r>
+          </w:p>
+          <w:p>
+            <w:pPr>
               <w:spacing w:before="0" w:after="80"/>
             </w:pPr>
             <w:r>
               <w:rPr>
                 <w:b/>
-                <w:sz w:val="18"/>
-              </w:rPr>
-              <w:t xml:space="preserve">Prescription: </w:t>
-            </w:r>
-            <w:r>
-              <w:rPr>
-                <w:b/>
-                <w:color w:val="1E40AF"/>
-                <w:sz w:val="18"/>
-              </w:rPr>
-              <w:t>4 Sets × 12–15 Reps (Drop-Set on 4th)  |  60s Rest</w:t>
+                <w:sz w:val="17"/>
+              </w:rPr>
+              <w:t xml:space="preserve">🎥 Video Tutorial: </w:t>
+            </w:r>
+            <w:r>
+              <w:rPr>
+                <w:color w:val="0E7490"/>
+                <w:sz w:val="17"/>
+                <w:u w:val="single"/>
+              </w:rPr>
+              <w:t>Renaissance Periodization - https://www.youtube.com/watch?v=4hTUCDUQaNA</w:t>
             </w:r>
           </w:p>
           <w:p>
@@ -6160,22 +6640,42 @@
           </w:p>
           <w:p>
             <w:pPr>
+              <w:spacing w:before="0" w:after="40"/>
+            </w:pPr>
+            <w:r>
+              <w:rPr>
+                <w:b/>
+                <w:sz w:val="18"/>
+              </w:rPr>
+              <w:t xml:space="preserve">Prescription: </w:t>
+            </w:r>
+            <w:r>
+              <w:rPr>
+                <w:b/>
+                <w:color w:val="1E40AF"/>
+                <w:sz w:val="18"/>
+              </w:rPr>
+              <w:t>3 Sets × 12–15 Reps  |  60s Rest</w:t>
+            </w:r>
+          </w:p>
+          <w:p>
+            <w:pPr>
               <w:spacing w:before="0" w:after="80"/>
             </w:pPr>
             <w:r>
               <w:rPr>
                 <w:b/>
-                <w:sz w:val="18"/>
-              </w:rPr>
-              <w:t xml:space="preserve">Prescription: </w:t>
-            </w:r>
-            <w:r>
-              <w:rPr>
-                <w:b/>
-                <w:color w:val="1E40AF"/>
-                <w:sz w:val="18"/>
-              </w:rPr>
-              <w:t>3 Sets × 12–15 Reps  |  60s Rest</w:t>
+                <w:sz w:val="17"/>
+              </w:rPr>
+              <w:t xml:space="preserve">🎥 Video Tutorial: </w:t>
+            </w:r>
+            <w:r>
+              <w:rPr>
+                <w:color w:val="0E7490"/>
+                <w:sz w:val="17"/>
+                <w:u w:val="single"/>
+              </w:rPr>
+              <w:t>Mind Pump TV - https://www.youtube.com/watch?v=6yMdhi2DVao</w:t>
             </w:r>
           </w:p>
           <w:p>
@@ -6398,22 +6898,42 @@
           </w:p>
           <w:p>
             <w:pPr>
+              <w:spacing w:before="0" w:after="40"/>
+            </w:pPr>
+            <w:r>
+              <w:rPr>
+                <w:b/>
+                <w:sz w:val="18"/>
+              </w:rPr>
+              <w:t xml:space="preserve">Prescription: </w:t>
+            </w:r>
+            <w:r>
+              <w:rPr>
+                <w:b/>
+                <w:color w:val="1E40AF"/>
+                <w:sz w:val="18"/>
+              </w:rPr>
+              <w:t>3 Sets × 10–12 Reps  |  90s Rest</w:t>
+            </w:r>
+          </w:p>
+          <w:p>
+            <w:pPr>
               <w:spacing w:before="0" w:after="80"/>
             </w:pPr>
             <w:r>
               <w:rPr>
                 <w:b/>
-                <w:sz w:val="18"/>
-              </w:rPr>
-              <w:t xml:space="preserve">Prescription: </w:t>
-            </w:r>
-            <w:r>
-              <w:rPr>
-                <w:b/>
-                <w:color w:val="1E40AF"/>
-                <w:sz w:val="18"/>
-              </w:rPr>
-              <w:t>3 Sets × 10–12 Reps  |  90s Rest</w:t>
+                <w:sz w:val="17"/>
+              </w:rPr>
+              <w:t xml:space="preserve">🎥 Video Tutorial: </w:t>
+            </w:r>
+            <w:r>
+              <w:rPr>
+                <w:color w:val="0E7490"/>
+                <w:sz w:val="17"/>
+                <w:u w:val="single"/>
+              </w:rPr>
+              <w:t>Scott Herman Fitness - https://www.youtube.com/watch?v=UYJsFzqdgK4</w:t>
             </w:r>
           </w:p>
           <w:p>
@@ -6636,22 +7156,42 @@
           </w:p>
           <w:p>
             <w:pPr>
+              <w:spacing w:before="0" w:after="40"/>
+            </w:pPr>
+            <w:r>
+              <w:rPr>
+                <w:b/>
+                <w:sz w:val="18"/>
+              </w:rPr>
+              <w:t xml:space="preserve">Prescription: </w:t>
+            </w:r>
+            <w:r>
+              <w:rPr>
+                <w:b/>
+                <w:color w:val="1E40AF"/>
+                <w:sz w:val="18"/>
+              </w:rPr>
+              <w:t>3 Sets × 10–12 Reps  |  60s Rest</w:t>
+            </w:r>
+          </w:p>
+          <w:p>
+            <w:pPr>
               <w:spacing w:before="0" w:after="80"/>
             </w:pPr>
             <w:r>
               <w:rPr>
                 <w:b/>
-                <w:sz w:val="18"/>
-              </w:rPr>
-              <w:t xml:space="preserve">Prescription: </w:t>
-            </w:r>
-            <w:r>
-              <w:rPr>
-                <w:b/>
-                <w:color w:val="1E40AF"/>
-                <w:sz w:val="18"/>
-              </w:rPr>
-              <w:t>3 Sets × 10–12 Reps  |  60s Rest</w:t>
+                <w:sz w:val="17"/>
+              </w:rPr>
+              <w:t xml:space="preserve">🎥 Video Tutorial: </w:t>
+            </w:r>
+            <w:r>
+              <w:rPr>
+                <w:color w:val="0E7490"/>
+                <w:sz w:val="17"/>
+                <w:u w:val="single"/>
+              </w:rPr>
+              <w:t>Team Evolve - https://www.youtube.com/watch?v=d7friQusjF8</w:t>
             </w:r>
           </w:p>
           <w:p>
@@ -6874,22 +7414,42 @@
           </w:p>
           <w:p>
             <w:pPr>
+              <w:spacing w:before="0" w:after="40"/>
+            </w:pPr>
+            <w:r>
+              <w:rPr>
+                <w:b/>
+                <w:sz w:val="18"/>
+              </w:rPr>
+              <w:t xml:space="preserve">Prescription: </w:t>
+            </w:r>
+            <w:r>
+              <w:rPr>
+                <w:b/>
+                <w:color w:val="1E40AF"/>
+                <w:sz w:val="18"/>
+              </w:rPr>
+              <w:t>3 Sets × 15–20 Reps  |  45s Rest</w:t>
+            </w:r>
+          </w:p>
+          <w:p>
+            <w:pPr>
               <w:spacing w:before="0" w:after="80"/>
             </w:pPr>
             <w:r>
               <w:rPr>
                 <w:b/>
-                <w:sz w:val="18"/>
-              </w:rPr>
-              <w:t xml:space="preserve">Prescription: </w:t>
-            </w:r>
-            <w:r>
-              <w:rPr>
-                <w:b/>
-                <w:color w:val="1E40AF"/>
-                <w:sz w:val="18"/>
-              </w:rPr>
-              <w:t>3 Sets × 15–20 Reps  |  45s Rest</w:t>
+                <w:sz w:val="17"/>
+              </w:rPr>
+              <w:t xml:space="preserve">🎥 Video Tutorial: </w:t>
+            </w:r>
+            <w:r>
+              <w:rPr>
+                <w:color w:val="0E7490"/>
+                <w:sz w:val="17"/>
+                <w:u w:val="single"/>
+              </w:rPr>
+              <w:t>Scott Herman Fitness - https://www.youtube.com/watch?v=qMtmHwaCmYI</w:t>
             </w:r>
           </w:p>
           <w:p>
@@ -7130,7 +7690,7 @@
         <w:rPr>
           <w:sz w:val="19"/>
         </w:rPr>
-        <w:t>1. Stomach Vacuums: 4 sets × 20s hold (Strengthens transverse abdominis, flattens lower belly protrusion).</w:t>
+        <w:t>1. Stomach Vacuums: 4 sets × 20s hold (Strengthens transverse abdominis, flattens lower belly protrusion) — Video: https://www.youtube.com/watch?v=b5GsE6ZHn_E</w:t>
       </w:r>
     </w:p>
     <w:p>
@@ -7141,7 +7701,7 @@
         <w:rPr>
           <w:sz w:val="19"/>
         </w:rPr>
-        <w:t>2. Kneeling Hip Flexor Stretch with Posterior Pelvic Tilt: 2 sets × 45–60s per leg (Lengthens tight psoas from WFH chair sitting).</w:t>
+        <w:t>2. Kneeling Hip Flexor Stretch with Posterior Pelvic Tilt: 2 sets × 45–60s per leg (Lengthens tight psoas from WFH chair sitting) — Video: https://www.youtube.com/watch?v=gqoPYLUgP48</w:t>
       </w:r>
     </w:p>
     <w:p>
@@ -7152,7 +7712,7 @@
         <w:rPr>
           <w:sz w:val="19"/>
         </w:rPr>
-        <w:t>3. Glute Squeezes &amp; Posterior Pelvic Tilt Tucks: 2 sets × 10 reps (Activates glutes before sitting at IT desk).</w:t>
+        <w:t>3. Glute Squeezes &amp; Posterior Pelvic Tilt Tucks: 2 sets × 10 reps (Activates glutes before sitting at IT desk) — Video: https://www.youtube.com/watch?v=mkbNJKiWNlI</w:t>
       </w:r>
     </w:p>
     <w:sectPr>

</xml_diff>